<commit_message>
Polish deck after two review rounds: clickable map, APA reference styling, chart captions
- Map areas are clickable; zoom transitions carry markers, labels and light with the map
- Reference slide in APA order with italic titles and hanging indents
- Consistent chart captions, units and estimate markers; label placements clear of markers
- Updated presentation and report deliverables

Co-Authored-By: Claude Opus 5.5 <noreply@anthropic.com>
Claude-Session: https://claude.ai/code/session_01NSwgojBzGPQ6DM2HvdFcCs
</commit_message>
<xml_diff>
--- a/Kuwait_Oil_and_Gas_Research_Report.docx
+++ b/Kuwait_Oil_and_Gas_Research_Report.docx
@@ -4,15 +4,15 @@
   <w:body>
     <w:p>
       <w:pPr>
-        <w:spacing w:after="300" w:before="400"/>
+        <w:spacing w:after="420" w:before="1300"/>
         <w:jc w:val="center"/>
       </w:pPr>
       <w:r>
         <w:drawing>
           <wp:inline distT="0" distB="0" distL="0" distR="0">
-            <wp:extent cx="1323975" cy="1323975"/>
+            <wp:extent cx="3381375" cy="1095375"/>
             <wp:effectExtent t="0" r="0" b="0" l="0"/>
-            <wp:docPr id="11" name="logo" descr="University logo" title="UTAS logo"/>
+            <wp:docPr id="11" name="logo" descr="University of Technology and Applied Sciences, Salalah" title="UTAS Salalah logo"/>
             <wp:cNvGraphicFramePr>
               <a:graphicFrameLocks xmlns:a="http://schemas.openxmlformats.org/drawingml/2006/main" noChangeAspect="1"/>
             </wp:cNvGraphicFramePr>
@@ -35,7 +35,7 @@
                   <pic:spPr bwMode="auto">
                     <a:xfrm>
                       <a:off x="0" y="0"/>
-                      <a:ext cx="1323975" cy="1323975"/>
+                      <a:ext cx="3381375" cy="1095375"/>
                     </a:xfrm>
                     <a:prstGeom prst="rect">
                       <a:avLst/>
@@ -61,15 +61,15 @@
           <w:i w:val="false"/>
           <w:iCs w:val="false"/>
           <w:color w:val="1F2937"/>
-          <w:sz w:val="30"/>
-          <w:szCs w:val="30"/>
-        </w:rPr>
-        <w:t xml:space="preserve">University of Technology and Applied Sciences</w:t>
-      </w:r>
-    </w:p>
-    <w:p>
-      <w:pPr>
-        <w:spacing w:after="600" w:before="0"/>
+          <w:sz w:val="28"/>
+          <w:szCs w:val="28"/>
+        </w:rPr>
+        <w:t xml:space="preserve">University of Technology and Applied Sciences – Salalah</w:t>
+      </w:r>
+    </w:p>
+    <w:p>
+      <w:pPr>
+        <w:spacing w:after="1500" w:before="0"/>
         <w:jc w:val="center"/>
       </w:pPr>
       <w:r>
@@ -154,7 +154,7 @@
     </w:p>
     <w:p>
       <w:pPr>
-        <w:spacing w:after="60" w:before="600"/>
+        <w:spacing w:after="60" w:before="1300"/>
         <w:jc w:val="center"/>
       </w:pPr>
       <w:r>
@@ -173,7 +173,7 @@
     </w:p>
     <w:p>
       <w:pPr>
-        <w:spacing w:after="600" w:before="0"/>
+        <w:spacing w:after="1500" w:before="0"/>
         <w:jc w:val="center"/>
       </w:pPr>
       <w:r>
@@ -7189,7 +7189,7 @@
         <w:jc w:val="both"/>
       </w:pPr>
       <w:r>
-        <w:t xml:space="preserve">Figure 2 shows eight decades of production. Output rose rapidly from 16 kb/d in 1946 to an all-time peak of 3.34 mb/d in 1972. It then fell after nationalisation, a conservation policy and the collapse of oil prices in the 1980s, reaching about 1.1 mb/d in 1985. The 1990–1991 invasion reduced output to only 185 kb/d in 1991. After reconstruction, production returned to 2.1 mb/d by 1995 and reached 3.15 mb/d (including natural gas liquids) in 2016 (Energy Institute, 2025). Since 2017 Kuwait's output has been governed by OPEC+ agreements: crude oil production alone averaged 2.41 mb/d in 2024 (JODI, 2026), and Kuwait's OPEC+ required production for September and October 2026 was 2,676 kb/d (OPEC, 2026b). The oil minister put Kuwait's production capacity at 3.2 mb/d in September 2025 (MEES, 2025b).</w:t>
+        <w:t xml:space="preserve">Figure 2 shows eight decades of production. Output rose rapidly from 16 kb/d in 1946 to an all-time peak of 3.34 mb/d in 1972. It then fell after nationalisation, a conservation policy and the collapse of oil prices in the 1980s, reaching about 1.1 mb/d in 1985. The 1990–1991 invasion reduced output to only 185 kb/d in 1991. After reconstruction, production returned to 2.1 mb/d by 1995 and reached an estimated post-war high of about 3.2 mb/d (including natural gas liquids; derived from Energy Institute energy data) in 2012 and 3.15 mb/d in 2016 (Energy Institute, 2025). Since 2017 Kuwait's output has been governed by OPEC+ agreements: crude oil production alone averaged 2.41 mb/d in 2024 (JODI, 2026), and Kuwait's OPEC+ required production for September and October 2026 was 2,676 kb/d (OPEC, 2026b). The oil minister put Kuwait's production capacity at 3.2 mb/d in September 2025 (MEES, 2025b).</w:t>
       </w:r>
     </w:p>
     <w:p>
@@ -8276,7 +8276,7 @@
                 <w:sz w:val="18"/>
                 <w:szCs w:val="18"/>
               </w:rPr>
-              <w:t xml:space="preserve">2016</w:t>
+              <w:t xml:space="preserve">2012</w:t>
             </w:r>
           </w:p>
         </w:tc>
@@ -8312,7 +8312,7 @@
                 <w:sz w:val="18"/>
                 <w:szCs w:val="18"/>
               </w:rPr>
-              <w:t xml:space="preserve">3,150</w:t>
+              <w:t xml:space="preserve">≈3,190</w:t>
             </w:r>
           </w:p>
         </w:tc>
@@ -8348,7 +8348,7 @@
                 <w:sz w:val="18"/>
                 <w:szCs w:val="18"/>
               </w:rPr>
-              <w:t xml:space="preserve">Post-war high</w:t>
+              <w:t xml:space="preserve">Post-war high (estimate)</w:t>
             </w:r>
           </w:p>
         </w:tc>

</xml_diff>

<commit_message>
Final QA round: correct Jurassic gas start date wording, balance reserves caption
- Non-associated Jurassic gas is no longer dated 'since 2018' (2018 was the start of the
  Jurassic Production Facilities); timeline label and report wording updated to match
- Updated presentation and report deliverables

Co-Authored-By: Claude Opus 5.5 <noreply@anthropic.com>
Claude-Session: https://claude.ai/code/session_01NSwgojBzGPQ6DM2HvdFcCs
</commit_message>
<xml_diff>
--- a/Kuwait_Oil_and_Gas_Research_Report.docx
+++ b/Kuwait_Oil_and_Gas_Research_Report.docx
@@ -2337,7 +2337,7 @@
         <w:jc w:val="both"/>
       </w:pPr>
       <w:r>
-        <w:t xml:space="preserve">After reconstruction, output climbed back above 3 mb/d in the 2010s (Energy Institute, 2025). Production from the Partitioned (formerly Neutral) Zone was shut in during 2014–2015 because of an operating dispute and resumed in early 2020 after a Saudi–Kuwaiti agreement at the end of 2019 (EIA, 2023a). Because gas demand grew faster than supply, Kuwait received its first LNG cargo in August 2009 at a floating regasification terminal at Mina Al-Ahmadi (EIA, 2011a). In January 2018 Kuwait began producing light oil and sour gas from the deep Jurassic reservoirs of North Kuwait (S&amp;P Global Commodity Insights, 2018a), and in July 2018 it exported its first cargo of the new Kuwait Super Light Crude (Kuwait News Agency [KUNA], 2018).</w:t>
+        <w:t xml:space="preserve">After reconstruction, output climbed back above 3 mb/d in the 2010s (Energy Institute, 2025). Production from the Partitioned (formerly Neutral) Zone was shut in during 2014–2015 because of an operating dispute and resumed in early 2020 after a Saudi–Kuwaiti agreement at the end of 2019 (EIA, 2023a). Because gas demand grew faster than supply, Kuwait received its first LNG cargo in August 2009 at a floating regasification terminal at Mina Al-Ahmadi (EIA, 2011a). In January 2018 new Jurassic Production Facilities began producing light oil and sour gas from the deep Jurassic reservoirs of North Kuwait (S&amp;P Global Commodity Insights, 2018a), and in July 2018 it exported its first cargo of the new Kuwait Super Light Crude (Kuwait News Agency [KUNA], 2018).</w:t>
       </w:r>
     </w:p>
     <w:p>
@@ -4162,7 +4162,7 @@
                 <w:sz w:val="18"/>
                 <w:szCs w:val="18"/>
               </w:rPr>
-              <w:t xml:space="preserve">Jurassic light oil and gas production; first Kuwait Super Light export</w:t>
+              <w:t xml:space="preserve">Jurassic Production Facilities start; first Kuwait Super Light export</w:t>
             </w:r>
           </w:p>
         </w:tc>

</xml_diff>